<commit_message>
add modeling with report
</commit_message>
<xml_diff>
--- a/Laporan Pattern.docx
+++ b/Laporan Pattern.docx
@@ -746,7 +746,7 @@
           <w:numId w:val="5"/>
         </w:numPr>
         <w:spacing w:line="360" w:lineRule="auto"/>
-        <w:ind w:left="851" w:hanging="425"/>
+        <w:ind w:left="426" w:hanging="425"/>
         <w:jc w:val="both"/>
         <w:rPr>
           <w:sz w:val="24"/>
@@ -787,7 +787,7 @@
           <w:numId w:val="5"/>
         </w:numPr>
         <w:spacing w:line="360" w:lineRule="auto"/>
-        <w:ind w:left="851" w:hanging="425"/>
+        <w:ind w:left="426" w:hanging="425"/>
         <w:jc w:val="both"/>
         <w:rPr>
           <w:sz w:val="24"/>
@@ -808,21 +808,7 @@
           <w:sz w:val="24"/>
           <w:szCs w:val="24"/>
         </w:rPr>
-        <w:t xml:space="preserve"> </w:t>
-      </w:r>
-      <w:r>
-        <w:rPr>
-          <w:sz w:val="24"/>
-          <w:szCs w:val="24"/>
-        </w:rPr>
-        <w:t>Pada tahap awal data terdiri dari 128 citra (32 per kelas), dan pada pembaruan progres telah dilakukan penambahan sampel untuk nominal baru</w:t>
-      </w:r>
-      <w:r>
-        <w:rPr>
-          <w:sz w:val="24"/>
-          <w:szCs w:val="24"/>
-        </w:rPr>
-        <w:t>.</w:t>
+        <w:t xml:space="preserve"> Pada tahap awal data terdiri dari 128 citra (32 per kelas), dan pada pembaruan progres telah dilakukan penambahan sampel untuk nominal baru.</w:t>
       </w:r>
       <w:r>
         <w:rPr>
@@ -842,7 +828,7 @@
           <w:numId w:val="5"/>
         </w:numPr>
         <w:spacing w:line="360" w:lineRule="auto"/>
-        <w:ind w:left="851" w:hanging="425"/>
+        <w:ind w:left="426" w:hanging="425"/>
         <w:rPr>
           <w:sz w:val="24"/>
           <w:szCs w:val="24"/>
@@ -901,6 +887,7 @@
     <w:p>
       <w:pPr>
         <w:spacing w:line="360" w:lineRule="auto"/>
+        <w:ind w:firstLine="426"/>
         <w:jc w:val="both"/>
         <w:rPr>
           <w:sz w:val="24"/>
@@ -923,6 +910,7 @@
           <w:numId w:val="10"/>
         </w:numPr>
         <w:spacing w:line="360" w:lineRule="auto"/>
+        <w:ind w:left="426"/>
         <w:jc w:val="both"/>
         <w:rPr>
           <w:sz w:val="24"/>
@@ -945,6 +933,7 @@
           <w:numId w:val="10"/>
         </w:numPr>
         <w:spacing w:line="360" w:lineRule="auto"/>
+        <w:ind w:left="426"/>
         <w:jc w:val="both"/>
         <w:rPr>
           <w:sz w:val="24"/>
@@ -967,6 +956,7 @@
           <w:numId w:val="10"/>
         </w:numPr>
         <w:spacing w:line="360" w:lineRule="auto"/>
+        <w:ind w:left="426"/>
         <w:jc w:val="both"/>
         <w:rPr>
           <w:sz w:val="24"/>
@@ -989,6 +979,7 @@
           <w:numId w:val="10"/>
         </w:numPr>
         <w:spacing w:line="360" w:lineRule="auto"/>
+        <w:ind w:left="426"/>
         <w:jc w:val="both"/>
         <w:rPr>
           <w:sz w:val="24"/>
@@ -1054,6 +1045,7 @@
     <w:p>
       <w:pPr>
         <w:spacing w:line="360" w:lineRule="auto"/>
+        <w:ind w:firstLine="426"/>
         <w:jc w:val="both"/>
         <w:rPr>
           <w:sz w:val="24"/>
@@ -1065,8 +1057,15 @@
           <w:sz w:val="24"/>
           <w:szCs w:val="24"/>
         </w:rPr>
+        <w:t xml:space="preserve">Ekstraksi ciri warna (HSV dan RGB) serta tekstur (GLCM) diposisikan sebagai skenario fitur baseline karena merupakan aspek fundamental dalam pengenalan uang </w:t>
+      </w:r>
+      <w:r>
+        <w:rPr>
+          <w:sz w:val="24"/>
+          <w:szCs w:val="24"/>
+        </w:rPr>
         <w:lastRenderedPageBreak/>
-        <w:t>Ekstraksi ciri warna (HSV dan RGB) serta tekstur (GLCM) diposisikan sebagai skenario fitur baseline karena merupakan aspek fundamental dalam pengenalan uang kertas. Fitur yang diekstrak kemudian dihitung, misal ekstraksi HSV / RGB tunggal menghasilkan 96 input algoritma, sementara HSV+GLCM dan RGB+GLCM menghasilkan 144 fitur input.</w:t>
+        <w:t>kertas. Fitur yang diekstrak kemudian dihitung, misal ekstraksi HSV / RGB tunggal menghasilkan 96 input algoritma, sementara HSV+GLCM dan RGB+GLCM menghasilkan 144 fitur input.</w:t>
       </w:r>
     </w:p>
     <w:p>
@@ -1101,7 +1100,7 @@
           <w:numId w:val="6"/>
         </w:numPr>
         <w:spacing w:line="360" w:lineRule="auto"/>
-        <w:ind w:left="851" w:hanging="425"/>
+        <w:ind w:left="426" w:hanging="425"/>
         <w:jc w:val="both"/>
         <w:rPr>
           <w:sz w:val="24"/>
@@ -1188,7 +1187,7 @@
           <w:numId w:val="6"/>
         </w:numPr>
         <w:spacing w:line="360" w:lineRule="auto"/>
-        <w:ind w:left="851" w:hanging="425"/>
+        <w:ind w:left="426" w:hanging="425"/>
         <w:jc w:val="both"/>
         <w:rPr>
           <w:sz w:val="24"/>
@@ -1268,7 +1267,7 @@
           <w:numId w:val="6"/>
         </w:numPr>
         <w:spacing w:line="360" w:lineRule="auto"/>
-        <w:ind w:left="851" w:hanging="425"/>
+        <w:ind w:left="426" w:hanging="425"/>
         <w:rPr>
           <w:sz w:val="24"/>
           <w:szCs w:val="24"/>
@@ -1299,7 +1298,7 @@
           <w:numId w:val="6"/>
         </w:numPr>
         <w:spacing w:line="360" w:lineRule="auto"/>
-        <w:ind w:left="851" w:hanging="425"/>
+        <w:ind w:left="426" w:hanging="425"/>
         <w:rPr>
           <w:sz w:val="24"/>
           <w:szCs w:val="24"/>
@@ -1323,7 +1322,7 @@
           <w:numId w:val="6"/>
         </w:numPr>
         <w:spacing w:line="360" w:lineRule="auto"/>
-        <w:ind w:left="851" w:hanging="425"/>
+        <w:ind w:left="426" w:hanging="425"/>
         <w:rPr>
           <w:sz w:val="24"/>
           <w:szCs w:val="24"/>
@@ -1366,6 +1365,7 @@
     <w:p>
       <w:pPr>
         <w:spacing w:line="360" w:lineRule="auto"/>
+        <w:ind w:firstLine="426"/>
         <w:jc w:val="both"/>
         <w:rPr>
           <w:sz w:val="24"/>
@@ -1531,16 +1531,25 @@
         </w:rPr>
         <w:t>Evaluasi Performa Model</w:t>
       </w:r>
+      <w:r>
+        <w:rPr>
+          <w:b/>
+          <w:bCs/>
+          <w:sz w:val="24"/>
+          <w:szCs w:val="24"/>
+        </w:rPr>
+        <w:t xml:space="preserve"> KNN dengan HSV</w:t>
+      </w:r>
     </w:p>
     <w:tbl>
       <w:tblPr>
         <w:tblStyle w:val="TableGrid"/>
         <w:tblW w:w="0" w:type="auto"/>
-        <w:tblInd w:w="426" w:type="dxa"/>
+        <w:tblInd w:w="-5" w:type="dxa"/>
         <w:tblLook w:val="04A0" w:firstRow="1" w:lastRow="0" w:firstColumn="1" w:lastColumn="0" w:noHBand="0" w:noVBand="1"/>
       </w:tblPr>
       <w:tblGrid>
-        <w:gridCol w:w="2246"/>
+        <w:gridCol w:w="2677"/>
         <w:gridCol w:w="2127"/>
         <w:gridCol w:w="1995"/>
         <w:gridCol w:w="1756"/>
@@ -1548,7 +1557,7 @@
       <w:tr>
         <w:tc>
           <w:tcPr>
-            <w:tcW w:w="2246" w:type="dxa"/>
+            <w:tcW w:w="2677" w:type="dxa"/>
           </w:tcPr>
           <w:p>
             <w:pPr>
@@ -1658,24 +1667,24 @@
       <w:tr>
         <w:tc>
           <w:tcPr>
-            <w:tcW w:w="2246" w:type="dxa"/>
-          </w:tcPr>
-          <w:p>
-            <w:pPr>
-              <w:pStyle w:val="ListParagraph"/>
-              <w:spacing w:line="360" w:lineRule="auto"/>
-              <w:ind w:left="0"/>
-              <w:rPr>
-                <w:sz w:val="24"/>
-                <w:szCs w:val="24"/>
-              </w:rPr>
-            </w:pPr>
-            <w:r>
-              <w:rPr>
-                <w:sz w:val="24"/>
-                <w:szCs w:val="24"/>
-              </w:rPr>
-              <w:t>Kelas A</w:t>
+            <w:tcW w:w="2677" w:type="dxa"/>
+          </w:tcPr>
+          <w:p>
+            <w:pPr>
+              <w:pStyle w:val="ListParagraph"/>
+              <w:spacing w:line="360" w:lineRule="auto"/>
+              <w:ind w:left="0"/>
+              <w:rPr>
+                <w:sz w:val="24"/>
+                <w:szCs w:val="24"/>
+              </w:rPr>
+            </w:pPr>
+            <w:r>
+              <w:rPr>
+                <w:sz w:val="24"/>
+                <w:szCs w:val="24"/>
+              </w:rPr>
+              <w:t>100k</w:t>
             </w:r>
           </w:p>
         </w:tc>
@@ -1693,6 +1702,13 @@
                 <w:szCs w:val="24"/>
               </w:rPr>
             </w:pPr>
+            <w:r>
+              <w:rPr>
+                <w:sz w:val="24"/>
+                <w:szCs w:val="24"/>
+              </w:rPr>
+              <w:t>0.86</w:t>
+            </w:r>
           </w:p>
         </w:tc>
         <w:tc>
@@ -1709,6 +1725,13 @@
                 <w:szCs w:val="24"/>
               </w:rPr>
             </w:pPr>
+            <w:r>
+              <w:rPr>
+                <w:sz w:val="24"/>
+                <w:szCs w:val="24"/>
+              </w:rPr>
+              <w:t>1.00</w:t>
+            </w:r>
           </w:p>
         </w:tc>
         <w:tc>
@@ -1725,30 +1748,37 @@
                 <w:szCs w:val="24"/>
               </w:rPr>
             </w:pPr>
+            <w:r>
+              <w:rPr>
+                <w:sz w:val="24"/>
+                <w:szCs w:val="24"/>
+              </w:rPr>
+              <w:t>0.92</w:t>
+            </w:r>
           </w:p>
         </w:tc>
       </w:tr>
       <w:tr>
         <w:tc>
           <w:tcPr>
-            <w:tcW w:w="2246" w:type="dxa"/>
-          </w:tcPr>
-          <w:p>
-            <w:pPr>
-              <w:pStyle w:val="ListParagraph"/>
-              <w:spacing w:line="360" w:lineRule="auto"/>
-              <w:ind w:left="0"/>
-              <w:rPr>
-                <w:sz w:val="24"/>
-                <w:szCs w:val="24"/>
-              </w:rPr>
-            </w:pPr>
-            <w:r>
-              <w:rPr>
-                <w:sz w:val="24"/>
-                <w:szCs w:val="24"/>
-              </w:rPr>
-              <w:t>Kelas B</w:t>
+            <w:tcW w:w="2677" w:type="dxa"/>
+          </w:tcPr>
+          <w:p>
+            <w:pPr>
+              <w:pStyle w:val="ListParagraph"/>
+              <w:spacing w:line="360" w:lineRule="auto"/>
+              <w:ind w:left="0"/>
+              <w:rPr>
+                <w:sz w:val="24"/>
+                <w:szCs w:val="24"/>
+              </w:rPr>
+            </w:pPr>
+            <w:r>
+              <w:rPr>
+                <w:sz w:val="24"/>
+                <w:szCs w:val="24"/>
+              </w:rPr>
+              <w:t>50k</w:t>
             </w:r>
           </w:p>
         </w:tc>
@@ -1766,6 +1796,13 @@
                 <w:szCs w:val="24"/>
               </w:rPr>
             </w:pPr>
+            <w:r>
+              <w:rPr>
+                <w:sz w:val="24"/>
+                <w:szCs w:val="24"/>
+              </w:rPr>
+              <w:t>1.00</w:t>
+            </w:r>
           </w:p>
         </w:tc>
         <w:tc>
@@ -1782,6 +1819,13 @@
                 <w:szCs w:val="24"/>
               </w:rPr>
             </w:pPr>
+            <w:r>
+              <w:rPr>
+                <w:sz w:val="24"/>
+                <w:szCs w:val="24"/>
+              </w:rPr>
+              <w:t>1.00</w:t>
+            </w:r>
           </w:p>
         </w:tc>
         <w:tc>
@@ -1798,13 +1842,396 @@
                 <w:szCs w:val="24"/>
               </w:rPr>
             </w:pPr>
+            <w:r>
+              <w:rPr>
+                <w:sz w:val="24"/>
+                <w:szCs w:val="24"/>
+              </w:rPr>
+              <w:t>1.00</w:t>
+            </w:r>
           </w:p>
         </w:tc>
       </w:tr>
       <w:tr>
         <w:tc>
           <w:tcPr>
-            <w:tcW w:w="2246" w:type="dxa"/>
+            <w:tcW w:w="2677" w:type="dxa"/>
+          </w:tcPr>
+          <w:p>
+            <w:pPr>
+              <w:pStyle w:val="ListParagraph"/>
+              <w:spacing w:line="360" w:lineRule="auto"/>
+              <w:ind w:left="0"/>
+              <w:rPr>
+                <w:sz w:val="24"/>
+                <w:szCs w:val="24"/>
+              </w:rPr>
+            </w:pPr>
+            <w:r>
+              <w:rPr>
+                <w:sz w:val="24"/>
+                <w:szCs w:val="24"/>
+              </w:rPr>
+              <w:t>20k</w:t>
+            </w:r>
+          </w:p>
+        </w:tc>
+        <w:tc>
+          <w:tcPr>
+            <w:tcW w:w="2127" w:type="dxa"/>
+          </w:tcPr>
+          <w:p>
+            <w:pPr>
+              <w:pStyle w:val="ListParagraph"/>
+              <w:spacing w:line="360" w:lineRule="auto"/>
+              <w:ind w:left="0"/>
+              <w:rPr>
+                <w:sz w:val="24"/>
+                <w:szCs w:val="24"/>
+              </w:rPr>
+            </w:pPr>
+            <w:r>
+              <w:rPr>
+                <w:sz w:val="24"/>
+                <w:szCs w:val="24"/>
+              </w:rPr>
+              <w:t>1.00</w:t>
+            </w:r>
+          </w:p>
+        </w:tc>
+        <w:tc>
+          <w:tcPr>
+            <w:tcW w:w="1995" w:type="dxa"/>
+          </w:tcPr>
+          <w:p>
+            <w:pPr>
+              <w:pStyle w:val="ListParagraph"/>
+              <w:spacing w:line="360" w:lineRule="auto"/>
+              <w:ind w:left="0"/>
+              <w:rPr>
+                <w:sz w:val="24"/>
+                <w:szCs w:val="24"/>
+              </w:rPr>
+            </w:pPr>
+            <w:r>
+              <w:rPr>
+                <w:sz w:val="24"/>
+                <w:szCs w:val="24"/>
+              </w:rPr>
+              <w:t>0.71</w:t>
+            </w:r>
+          </w:p>
+        </w:tc>
+        <w:tc>
+          <w:tcPr>
+            <w:tcW w:w="1756" w:type="dxa"/>
+          </w:tcPr>
+          <w:p>
+            <w:pPr>
+              <w:pStyle w:val="ListParagraph"/>
+              <w:spacing w:line="360" w:lineRule="auto"/>
+              <w:ind w:left="0"/>
+              <w:rPr>
+                <w:sz w:val="24"/>
+                <w:szCs w:val="24"/>
+              </w:rPr>
+            </w:pPr>
+            <w:r>
+              <w:rPr>
+                <w:sz w:val="24"/>
+                <w:szCs w:val="24"/>
+              </w:rPr>
+              <w:t>0.83</w:t>
+            </w:r>
+          </w:p>
+        </w:tc>
+      </w:tr>
+      <w:tr>
+        <w:tc>
+          <w:tcPr>
+            <w:tcW w:w="2677" w:type="dxa"/>
+          </w:tcPr>
+          <w:p>
+            <w:pPr>
+              <w:pStyle w:val="ListParagraph"/>
+              <w:spacing w:line="360" w:lineRule="auto"/>
+              <w:ind w:left="0"/>
+              <w:rPr>
+                <w:sz w:val="24"/>
+                <w:szCs w:val="24"/>
+              </w:rPr>
+            </w:pPr>
+            <w:r>
+              <w:rPr>
+                <w:sz w:val="24"/>
+                <w:szCs w:val="24"/>
+              </w:rPr>
+              <w:t>10k</w:t>
+            </w:r>
+          </w:p>
+        </w:tc>
+        <w:tc>
+          <w:tcPr>
+            <w:tcW w:w="2127" w:type="dxa"/>
+          </w:tcPr>
+          <w:p>
+            <w:pPr>
+              <w:pStyle w:val="ListParagraph"/>
+              <w:spacing w:line="360" w:lineRule="auto"/>
+              <w:ind w:left="0"/>
+              <w:rPr>
+                <w:sz w:val="24"/>
+                <w:szCs w:val="24"/>
+              </w:rPr>
+            </w:pPr>
+            <w:r>
+              <w:rPr>
+                <w:sz w:val="24"/>
+                <w:szCs w:val="24"/>
+              </w:rPr>
+              <w:t>0.62</w:t>
+            </w:r>
+          </w:p>
+        </w:tc>
+        <w:tc>
+          <w:tcPr>
+            <w:tcW w:w="1995" w:type="dxa"/>
+          </w:tcPr>
+          <w:p>
+            <w:pPr>
+              <w:pStyle w:val="ListParagraph"/>
+              <w:spacing w:line="360" w:lineRule="auto"/>
+              <w:ind w:left="0"/>
+              <w:rPr>
+                <w:sz w:val="24"/>
+                <w:szCs w:val="24"/>
+              </w:rPr>
+            </w:pPr>
+            <w:r>
+              <w:rPr>
+                <w:sz w:val="24"/>
+                <w:szCs w:val="24"/>
+              </w:rPr>
+              <w:t>0.83</w:t>
+            </w:r>
+          </w:p>
+        </w:tc>
+        <w:tc>
+          <w:tcPr>
+            <w:tcW w:w="1756" w:type="dxa"/>
+          </w:tcPr>
+          <w:p>
+            <w:pPr>
+              <w:pStyle w:val="ListParagraph"/>
+              <w:spacing w:line="360" w:lineRule="auto"/>
+              <w:ind w:left="0"/>
+              <w:rPr>
+                <w:sz w:val="24"/>
+                <w:szCs w:val="24"/>
+              </w:rPr>
+            </w:pPr>
+            <w:r>
+              <w:rPr>
+                <w:sz w:val="24"/>
+                <w:szCs w:val="24"/>
+              </w:rPr>
+              <w:t>0.71</w:t>
+            </w:r>
+          </w:p>
+        </w:tc>
+      </w:tr>
+      <w:tr>
+        <w:tc>
+          <w:tcPr>
+            <w:tcW w:w="2677" w:type="dxa"/>
+          </w:tcPr>
+          <w:p>
+            <w:pPr>
+              <w:pStyle w:val="ListParagraph"/>
+              <w:spacing w:line="360" w:lineRule="auto"/>
+              <w:ind w:left="0"/>
+              <w:rPr>
+                <w:sz w:val="24"/>
+                <w:szCs w:val="24"/>
+              </w:rPr>
+            </w:pPr>
+            <w:r>
+              <w:rPr>
+                <w:sz w:val="24"/>
+                <w:szCs w:val="24"/>
+              </w:rPr>
+              <w:t>5k</w:t>
+            </w:r>
+          </w:p>
+        </w:tc>
+        <w:tc>
+          <w:tcPr>
+            <w:tcW w:w="2127" w:type="dxa"/>
+          </w:tcPr>
+          <w:p>
+            <w:pPr>
+              <w:pStyle w:val="ListParagraph"/>
+              <w:spacing w:line="360" w:lineRule="auto"/>
+              <w:ind w:left="0"/>
+              <w:rPr>
+                <w:sz w:val="24"/>
+                <w:szCs w:val="24"/>
+              </w:rPr>
+            </w:pPr>
+            <w:r>
+              <w:rPr>
+                <w:sz w:val="24"/>
+                <w:szCs w:val="24"/>
+              </w:rPr>
+              <w:t>0.67</w:t>
+            </w:r>
+          </w:p>
+        </w:tc>
+        <w:tc>
+          <w:tcPr>
+            <w:tcW w:w="1995" w:type="dxa"/>
+          </w:tcPr>
+          <w:p>
+            <w:pPr>
+              <w:pStyle w:val="ListParagraph"/>
+              <w:spacing w:line="360" w:lineRule="auto"/>
+              <w:ind w:left="0"/>
+              <w:rPr>
+                <w:sz w:val="24"/>
+                <w:szCs w:val="24"/>
+              </w:rPr>
+            </w:pPr>
+            <w:r>
+              <w:rPr>
+                <w:sz w:val="24"/>
+                <w:szCs w:val="24"/>
+              </w:rPr>
+              <w:t>0.67</w:t>
+            </w:r>
+          </w:p>
+        </w:tc>
+        <w:tc>
+          <w:tcPr>
+            <w:tcW w:w="1756" w:type="dxa"/>
+          </w:tcPr>
+          <w:p>
+            <w:pPr>
+              <w:pStyle w:val="ListParagraph"/>
+              <w:spacing w:line="360" w:lineRule="auto"/>
+              <w:ind w:left="0"/>
+              <w:rPr>
+                <w:sz w:val="24"/>
+                <w:szCs w:val="24"/>
+              </w:rPr>
+            </w:pPr>
+            <w:r>
+              <w:rPr>
+                <w:sz w:val="24"/>
+                <w:szCs w:val="24"/>
+              </w:rPr>
+              <w:t>0.67</w:t>
+            </w:r>
+          </w:p>
+        </w:tc>
+      </w:tr>
+      <w:tr>
+        <w:tc>
+          <w:tcPr>
+            <w:tcW w:w="2677" w:type="dxa"/>
+          </w:tcPr>
+          <w:p>
+            <w:pPr>
+              <w:pStyle w:val="ListParagraph"/>
+              <w:spacing w:line="360" w:lineRule="auto"/>
+              <w:ind w:left="0"/>
+              <w:rPr>
+                <w:sz w:val="24"/>
+                <w:szCs w:val="24"/>
+              </w:rPr>
+            </w:pPr>
+            <w:r>
+              <w:rPr>
+                <w:sz w:val="24"/>
+                <w:szCs w:val="24"/>
+              </w:rPr>
+              <w:t>2k</w:t>
+            </w:r>
+          </w:p>
+        </w:tc>
+        <w:tc>
+          <w:tcPr>
+            <w:tcW w:w="2127" w:type="dxa"/>
+          </w:tcPr>
+          <w:p>
+            <w:pPr>
+              <w:pStyle w:val="ListParagraph"/>
+              <w:spacing w:line="360" w:lineRule="auto"/>
+              <w:ind w:left="0"/>
+              <w:rPr>
+                <w:sz w:val="24"/>
+                <w:szCs w:val="24"/>
+              </w:rPr>
+            </w:pPr>
+            <w:r>
+              <w:rPr>
+                <w:sz w:val="24"/>
+                <w:szCs w:val="24"/>
+              </w:rPr>
+              <w:t>0.83</w:t>
+            </w:r>
+          </w:p>
+        </w:tc>
+        <w:tc>
+          <w:tcPr>
+            <w:tcW w:w="1995" w:type="dxa"/>
+          </w:tcPr>
+          <w:p>
+            <w:pPr>
+              <w:pStyle w:val="ListParagraph"/>
+              <w:spacing w:line="360" w:lineRule="auto"/>
+              <w:ind w:left="0"/>
+              <w:rPr>
+                <w:sz w:val="24"/>
+                <w:szCs w:val="24"/>
+              </w:rPr>
+            </w:pPr>
+            <w:r>
+              <w:rPr>
+                <w:sz w:val="24"/>
+                <w:szCs w:val="24"/>
+              </w:rPr>
+              <w:t>0.71</w:t>
+            </w:r>
+          </w:p>
+        </w:tc>
+        <w:tc>
+          <w:tcPr>
+            <w:tcW w:w="1756" w:type="dxa"/>
+          </w:tcPr>
+          <w:p>
+            <w:pPr>
+              <w:pStyle w:val="ListParagraph"/>
+              <w:spacing w:line="360" w:lineRule="auto"/>
+              <w:ind w:left="0"/>
+              <w:rPr>
+                <w:sz w:val="24"/>
+                <w:szCs w:val="24"/>
+              </w:rPr>
+            </w:pPr>
+            <w:r>
+              <w:rPr>
+                <w:sz w:val="24"/>
+                <w:szCs w:val="24"/>
+              </w:rPr>
+              <w:t>0.77</w:t>
+            </w:r>
+          </w:p>
+        </w:tc>
+      </w:tr>
+      <w:tr>
+        <w:tc>
+          <w:tcPr>
+            <w:tcW w:w="2677" w:type="dxa"/>
           </w:tcPr>
           <w:p>
             <w:pPr>
@@ -1827,6 +2254,15 @@
               </w:rPr>
               <w:t>Rata-rata (Average</w:t>
             </w:r>
+            <w:r>
+              <w:rPr>
+                <w:b/>
+                <w:bCs/>
+                <w:sz w:val="24"/>
+                <w:szCs w:val="24"/>
+              </w:rPr>
+              <w:t>)</w:t>
+            </w:r>
           </w:p>
         </w:tc>
         <w:tc>
@@ -1836,12 +2272,18 @@
           <w:p>
             <w:pPr>
               <w:spacing w:line="360" w:lineRule="auto"/>
-              <w:ind w:left="426"/>
-              <w:rPr>
-                <w:sz w:val="24"/>
-                <w:szCs w:val="24"/>
-              </w:rPr>
-            </w:pPr>
+              <w:rPr>
+                <w:sz w:val="24"/>
+                <w:szCs w:val="24"/>
+              </w:rPr>
+            </w:pPr>
+            <w:r>
+              <w:rPr>
+                <w:sz w:val="24"/>
+                <w:szCs w:val="24"/>
+              </w:rPr>
+              <w:t>0.83</w:t>
+            </w:r>
           </w:p>
         </w:tc>
         <w:tc>
@@ -1858,6 +2300,13 @@
                 <w:szCs w:val="24"/>
               </w:rPr>
             </w:pPr>
+            <w:r>
+              <w:rPr>
+                <w:sz w:val="24"/>
+                <w:szCs w:val="24"/>
+              </w:rPr>
+              <w:t>0.82</w:t>
+            </w:r>
           </w:p>
         </w:tc>
         <w:tc>
@@ -1874,6 +2323,13 @@
                 <w:szCs w:val="24"/>
               </w:rPr>
             </w:pPr>
+            <w:r>
+              <w:rPr>
+                <w:sz w:val="24"/>
+                <w:szCs w:val="24"/>
+              </w:rPr>
+              <w:t>0.82</w:t>
+            </w:r>
           </w:p>
         </w:tc>
       </w:tr>
@@ -1886,7 +2342,7 @@
           <w:numId w:val="7"/>
         </w:numPr>
         <w:spacing w:line="360" w:lineRule="auto"/>
-        <w:ind w:left="851" w:hanging="425"/>
+        <w:ind w:left="426" w:hanging="425"/>
         <w:rPr>
           <w:sz w:val="24"/>
           <w:szCs w:val="24"/>
@@ -1900,6 +2356,22 @@
           <w:szCs w:val="24"/>
         </w:rPr>
         <w:t>Akurasi Keseluruhan (Overall Accuracy):</w:t>
+      </w:r>
+      <w:r>
+        <w:rPr>
+          <w:b/>
+          <w:bCs/>
+          <w:sz w:val="24"/>
+          <w:szCs w:val="24"/>
+        </w:rPr>
+        <w:t xml:space="preserve"> </w:t>
+      </w:r>
+      <w:r>
+        <w:rPr>
+          <w:sz w:val="24"/>
+          <w:szCs w:val="24"/>
+        </w:rPr>
+        <w:t>0.82</w:t>
       </w:r>
     </w:p>
     <w:p>
@@ -1910,7 +2382,7 @@
           <w:numId w:val="7"/>
         </w:numPr>
         <w:spacing w:line="360" w:lineRule="auto"/>
-        <w:ind w:left="851" w:hanging="425"/>
+        <w:ind w:left="426" w:hanging="425"/>
         <w:rPr>
           <w:sz w:val="24"/>
           <w:szCs w:val="24"/>
@@ -1925,6 +2397,1956 @@
         </w:rPr>
         <w:t>Confussion Matrix:</w:t>
       </w:r>
+    </w:p>
+    <w:p>
+      <w:pPr>
+        <w:pStyle w:val="ListParagraph"/>
+        <w:spacing w:line="360" w:lineRule="auto"/>
+        <w:ind w:left="426"/>
+        <w:rPr>
+          <w:sz w:val="24"/>
+          <w:szCs w:val="24"/>
+        </w:rPr>
+      </w:pPr>
+      <w:r>
+        <w:rPr>
+          <w:sz w:val="24"/>
+          <w:szCs w:val="24"/>
+        </w:rPr>
+        <w:lastRenderedPageBreak/>
+        <w:drawing>
+          <wp:inline distT="0" distB="0" distL="0" distR="0" wp14:anchorId="6FAD6C72" wp14:editId="408101FB">
+            <wp:extent cx="2800350" cy="2902927"/>
+            <wp:effectExtent l="0" t="0" r="0" b="0"/>
+            <wp:docPr id="585554475" name="Picture 1"/>
+            <wp:cNvGraphicFramePr>
+              <a:graphicFrameLocks xmlns:a="http://schemas.openxmlformats.org/drawingml/2006/main" noChangeAspect="1"/>
+            </wp:cNvGraphicFramePr>
+            <a:graphic xmlns:a="http://schemas.openxmlformats.org/drawingml/2006/main">
+              <a:graphicData uri="http://schemas.openxmlformats.org/drawingml/2006/picture">
+                <pic:pic xmlns:pic="http://schemas.openxmlformats.org/drawingml/2006/picture">
+                  <pic:nvPicPr>
+                    <pic:cNvPr id="585554475" name=""/>
+                    <pic:cNvPicPr/>
+                  </pic:nvPicPr>
+                  <pic:blipFill>
+                    <a:blip r:embed="rId5"/>
+                    <a:stretch>
+                      <a:fillRect/>
+                    </a:stretch>
+                  </pic:blipFill>
+                  <pic:spPr>
+                    <a:xfrm>
+                      <a:off x="0" y="0"/>
+                      <a:ext cx="2802835" cy="2905503"/>
+                    </a:xfrm>
+                    <a:prstGeom prst="rect">
+                      <a:avLst/>
+                    </a:prstGeom>
+                  </pic:spPr>
+                </pic:pic>
+              </a:graphicData>
+            </a:graphic>
+          </wp:inline>
+        </w:drawing>
+      </w:r>
+    </w:p>
+    <w:p>
+      <w:pPr>
+        <w:pStyle w:val="ListParagraph"/>
+        <w:numPr>
+          <w:ilvl w:val="1"/>
+          <w:numId w:val="4"/>
+        </w:numPr>
+        <w:spacing w:line="360" w:lineRule="auto"/>
+        <w:ind w:left="426" w:hanging="426"/>
+        <w:rPr>
+          <w:sz w:val="24"/>
+          <w:szCs w:val="24"/>
+        </w:rPr>
+      </w:pPr>
+      <w:r>
+        <w:rPr>
+          <w:b/>
+          <w:bCs/>
+          <w:sz w:val="24"/>
+          <w:szCs w:val="24"/>
+        </w:rPr>
+        <w:t xml:space="preserve">Evaluasi Performa Model </w:t>
+      </w:r>
+      <w:r>
+        <w:rPr>
+          <w:b/>
+          <w:bCs/>
+          <w:sz w:val="24"/>
+          <w:szCs w:val="24"/>
+        </w:rPr>
+        <w:t>Random Forest dengan HSV</w:t>
+      </w:r>
+    </w:p>
+    <w:tbl>
+      <w:tblPr>
+        <w:tblStyle w:val="TableGrid"/>
+        <w:tblW w:w="0" w:type="auto"/>
+        <w:tblInd w:w="-5" w:type="dxa"/>
+        <w:tblLook w:val="04A0" w:firstRow="1" w:lastRow="0" w:firstColumn="1" w:lastColumn="0" w:noHBand="0" w:noVBand="1"/>
+      </w:tblPr>
+      <w:tblGrid>
+        <w:gridCol w:w="2677"/>
+        <w:gridCol w:w="2127"/>
+        <w:gridCol w:w="1995"/>
+        <w:gridCol w:w="1756"/>
+      </w:tblGrid>
+      <w:tr>
+        <w:tc>
+          <w:tcPr>
+            <w:tcW w:w="2677" w:type="dxa"/>
+          </w:tcPr>
+          <w:p>
+            <w:pPr>
+              <w:pStyle w:val="ListParagraph"/>
+              <w:spacing w:line="360" w:lineRule="auto"/>
+              <w:ind w:left="0"/>
+              <w:rPr>
+                <w:b/>
+                <w:bCs/>
+                <w:sz w:val="24"/>
+                <w:szCs w:val="24"/>
+              </w:rPr>
+            </w:pPr>
+            <w:r>
+              <w:rPr>
+                <w:b/>
+                <w:bCs/>
+                <w:sz w:val="24"/>
+                <w:szCs w:val="24"/>
+              </w:rPr>
+              <w:t>Kelas/Label</w:t>
+            </w:r>
+          </w:p>
+        </w:tc>
+        <w:tc>
+          <w:tcPr>
+            <w:tcW w:w="2127" w:type="dxa"/>
+          </w:tcPr>
+          <w:p>
+            <w:pPr>
+              <w:pStyle w:val="ListParagraph"/>
+              <w:spacing w:line="360" w:lineRule="auto"/>
+              <w:ind w:left="0"/>
+              <w:rPr>
+                <w:b/>
+                <w:bCs/>
+                <w:sz w:val="24"/>
+                <w:szCs w:val="24"/>
+              </w:rPr>
+            </w:pPr>
+            <w:r>
+              <w:rPr>
+                <w:b/>
+                <w:bCs/>
+                <w:sz w:val="24"/>
+                <w:szCs w:val="24"/>
+              </w:rPr>
+              <w:t>Precision</w:t>
+            </w:r>
+          </w:p>
+        </w:tc>
+        <w:tc>
+          <w:tcPr>
+            <w:tcW w:w="1995" w:type="dxa"/>
+          </w:tcPr>
+          <w:p>
+            <w:pPr>
+              <w:pStyle w:val="ListParagraph"/>
+              <w:spacing w:line="360" w:lineRule="auto"/>
+              <w:ind w:left="0"/>
+              <w:rPr>
+                <w:b/>
+                <w:bCs/>
+                <w:sz w:val="24"/>
+                <w:szCs w:val="24"/>
+              </w:rPr>
+            </w:pPr>
+            <w:r>
+              <w:rPr>
+                <w:b/>
+                <w:bCs/>
+                <w:sz w:val="24"/>
+                <w:szCs w:val="24"/>
+              </w:rPr>
+              <w:t>Recall</w:t>
+            </w:r>
+          </w:p>
+        </w:tc>
+        <w:tc>
+          <w:tcPr>
+            <w:tcW w:w="1756" w:type="dxa"/>
+          </w:tcPr>
+          <w:p>
+            <w:pPr>
+              <w:pStyle w:val="ListParagraph"/>
+              <w:spacing w:line="360" w:lineRule="auto"/>
+              <w:ind w:left="0"/>
+              <w:rPr>
+                <w:b/>
+                <w:bCs/>
+                <w:sz w:val="24"/>
+                <w:szCs w:val="24"/>
+              </w:rPr>
+            </w:pPr>
+            <w:r>
+              <w:rPr>
+                <w:b/>
+                <w:bCs/>
+                <w:sz w:val="24"/>
+                <w:szCs w:val="24"/>
+              </w:rPr>
+              <w:t>F1-Score</w:t>
+            </w:r>
+          </w:p>
+        </w:tc>
+      </w:tr>
+      <w:tr>
+        <w:tc>
+          <w:tcPr>
+            <w:tcW w:w="2677" w:type="dxa"/>
+          </w:tcPr>
+          <w:p>
+            <w:pPr>
+              <w:pStyle w:val="ListParagraph"/>
+              <w:spacing w:line="360" w:lineRule="auto"/>
+              <w:ind w:left="0"/>
+              <w:rPr>
+                <w:sz w:val="24"/>
+                <w:szCs w:val="24"/>
+              </w:rPr>
+            </w:pPr>
+            <w:r>
+              <w:rPr>
+                <w:sz w:val="24"/>
+                <w:szCs w:val="24"/>
+              </w:rPr>
+              <w:t>100k</w:t>
+            </w:r>
+          </w:p>
+        </w:tc>
+        <w:tc>
+          <w:tcPr>
+            <w:tcW w:w="2127" w:type="dxa"/>
+          </w:tcPr>
+          <w:p>
+            <w:pPr>
+              <w:pStyle w:val="ListParagraph"/>
+              <w:spacing w:line="360" w:lineRule="auto"/>
+              <w:ind w:left="0"/>
+              <w:rPr>
+                <w:sz w:val="24"/>
+                <w:szCs w:val="24"/>
+              </w:rPr>
+            </w:pPr>
+            <w:r>
+              <w:rPr>
+                <w:sz w:val="24"/>
+                <w:szCs w:val="24"/>
+              </w:rPr>
+              <w:t>1.00</w:t>
+            </w:r>
+          </w:p>
+        </w:tc>
+        <w:tc>
+          <w:tcPr>
+            <w:tcW w:w="1995" w:type="dxa"/>
+          </w:tcPr>
+          <w:p>
+            <w:pPr>
+              <w:pStyle w:val="ListParagraph"/>
+              <w:spacing w:line="360" w:lineRule="auto"/>
+              <w:ind w:left="0"/>
+              <w:rPr>
+                <w:sz w:val="24"/>
+                <w:szCs w:val="24"/>
+              </w:rPr>
+            </w:pPr>
+            <w:r>
+              <w:rPr>
+                <w:sz w:val="24"/>
+                <w:szCs w:val="24"/>
+              </w:rPr>
+              <w:t>1.00</w:t>
+            </w:r>
+          </w:p>
+        </w:tc>
+        <w:tc>
+          <w:tcPr>
+            <w:tcW w:w="1756" w:type="dxa"/>
+          </w:tcPr>
+          <w:p>
+            <w:pPr>
+              <w:pStyle w:val="ListParagraph"/>
+              <w:spacing w:line="360" w:lineRule="auto"/>
+              <w:ind w:left="0"/>
+              <w:rPr>
+                <w:sz w:val="24"/>
+                <w:szCs w:val="24"/>
+              </w:rPr>
+            </w:pPr>
+            <w:r>
+              <w:rPr>
+                <w:sz w:val="24"/>
+                <w:szCs w:val="24"/>
+              </w:rPr>
+              <w:t>1.00</w:t>
+            </w:r>
+          </w:p>
+        </w:tc>
+      </w:tr>
+      <w:tr>
+        <w:tc>
+          <w:tcPr>
+            <w:tcW w:w="2677" w:type="dxa"/>
+          </w:tcPr>
+          <w:p>
+            <w:pPr>
+              <w:pStyle w:val="ListParagraph"/>
+              <w:spacing w:line="360" w:lineRule="auto"/>
+              <w:ind w:left="0"/>
+              <w:rPr>
+                <w:sz w:val="24"/>
+                <w:szCs w:val="24"/>
+              </w:rPr>
+            </w:pPr>
+            <w:r>
+              <w:rPr>
+                <w:sz w:val="24"/>
+                <w:szCs w:val="24"/>
+              </w:rPr>
+              <w:t>50k</w:t>
+            </w:r>
+          </w:p>
+        </w:tc>
+        <w:tc>
+          <w:tcPr>
+            <w:tcW w:w="2127" w:type="dxa"/>
+          </w:tcPr>
+          <w:p>
+            <w:pPr>
+              <w:pStyle w:val="ListParagraph"/>
+              <w:spacing w:line="360" w:lineRule="auto"/>
+              <w:ind w:left="0"/>
+              <w:rPr>
+                <w:sz w:val="24"/>
+                <w:szCs w:val="24"/>
+              </w:rPr>
+            </w:pPr>
+            <w:r>
+              <w:rPr>
+                <w:sz w:val="24"/>
+                <w:szCs w:val="24"/>
+              </w:rPr>
+              <w:t>1.00</w:t>
+            </w:r>
+          </w:p>
+        </w:tc>
+        <w:tc>
+          <w:tcPr>
+            <w:tcW w:w="1995" w:type="dxa"/>
+          </w:tcPr>
+          <w:p>
+            <w:pPr>
+              <w:pStyle w:val="ListParagraph"/>
+              <w:spacing w:line="360" w:lineRule="auto"/>
+              <w:ind w:left="0"/>
+              <w:rPr>
+                <w:sz w:val="24"/>
+                <w:szCs w:val="24"/>
+              </w:rPr>
+            </w:pPr>
+            <w:r>
+              <w:rPr>
+                <w:sz w:val="24"/>
+                <w:szCs w:val="24"/>
+              </w:rPr>
+              <w:t>1.00</w:t>
+            </w:r>
+          </w:p>
+        </w:tc>
+        <w:tc>
+          <w:tcPr>
+            <w:tcW w:w="1756" w:type="dxa"/>
+          </w:tcPr>
+          <w:p>
+            <w:pPr>
+              <w:pStyle w:val="ListParagraph"/>
+              <w:spacing w:line="360" w:lineRule="auto"/>
+              <w:ind w:left="0"/>
+              <w:rPr>
+                <w:sz w:val="24"/>
+                <w:szCs w:val="24"/>
+              </w:rPr>
+            </w:pPr>
+            <w:r>
+              <w:rPr>
+                <w:sz w:val="24"/>
+                <w:szCs w:val="24"/>
+              </w:rPr>
+              <w:t>1.00</w:t>
+            </w:r>
+          </w:p>
+        </w:tc>
+      </w:tr>
+      <w:tr>
+        <w:tc>
+          <w:tcPr>
+            <w:tcW w:w="2677" w:type="dxa"/>
+          </w:tcPr>
+          <w:p>
+            <w:pPr>
+              <w:pStyle w:val="ListParagraph"/>
+              <w:spacing w:line="360" w:lineRule="auto"/>
+              <w:ind w:left="0"/>
+              <w:rPr>
+                <w:sz w:val="24"/>
+                <w:szCs w:val="24"/>
+              </w:rPr>
+            </w:pPr>
+            <w:r>
+              <w:rPr>
+                <w:sz w:val="24"/>
+                <w:szCs w:val="24"/>
+              </w:rPr>
+              <w:t>20k</w:t>
+            </w:r>
+          </w:p>
+        </w:tc>
+        <w:tc>
+          <w:tcPr>
+            <w:tcW w:w="2127" w:type="dxa"/>
+          </w:tcPr>
+          <w:p>
+            <w:pPr>
+              <w:pStyle w:val="ListParagraph"/>
+              <w:spacing w:line="360" w:lineRule="auto"/>
+              <w:ind w:left="0"/>
+              <w:rPr>
+                <w:sz w:val="24"/>
+                <w:szCs w:val="24"/>
+              </w:rPr>
+            </w:pPr>
+            <w:r>
+              <w:rPr>
+                <w:sz w:val="24"/>
+                <w:szCs w:val="24"/>
+              </w:rPr>
+              <w:t>1.00</w:t>
+            </w:r>
+          </w:p>
+        </w:tc>
+        <w:tc>
+          <w:tcPr>
+            <w:tcW w:w="1995" w:type="dxa"/>
+          </w:tcPr>
+          <w:p>
+            <w:pPr>
+              <w:pStyle w:val="ListParagraph"/>
+              <w:spacing w:line="360" w:lineRule="auto"/>
+              <w:ind w:left="0"/>
+              <w:rPr>
+                <w:sz w:val="24"/>
+                <w:szCs w:val="24"/>
+              </w:rPr>
+            </w:pPr>
+            <w:r>
+              <w:rPr>
+                <w:sz w:val="24"/>
+                <w:szCs w:val="24"/>
+              </w:rPr>
+              <w:t>1.00</w:t>
+            </w:r>
+          </w:p>
+        </w:tc>
+        <w:tc>
+          <w:tcPr>
+            <w:tcW w:w="1756" w:type="dxa"/>
+          </w:tcPr>
+          <w:p>
+            <w:pPr>
+              <w:pStyle w:val="ListParagraph"/>
+              <w:spacing w:line="360" w:lineRule="auto"/>
+              <w:ind w:left="0"/>
+              <w:rPr>
+                <w:sz w:val="24"/>
+                <w:szCs w:val="24"/>
+              </w:rPr>
+            </w:pPr>
+            <w:r>
+              <w:rPr>
+                <w:sz w:val="24"/>
+                <w:szCs w:val="24"/>
+              </w:rPr>
+              <w:t>1.00</w:t>
+            </w:r>
+          </w:p>
+        </w:tc>
+      </w:tr>
+      <w:tr>
+        <w:tc>
+          <w:tcPr>
+            <w:tcW w:w="2677" w:type="dxa"/>
+          </w:tcPr>
+          <w:p>
+            <w:pPr>
+              <w:pStyle w:val="ListParagraph"/>
+              <w:spacing w:line="360" w:lineRule="auto"/>
+              <w:ind w:left="0"/>
+              <w:rPr>
+                <w:sz w:val="24"/>
+                <w:szCs w:val="24"/>
+              </w:rPr>
+            </w:pPr>
+            <w:r>
+              <w:rPr>
+                <w:sz w:val="24"/>
+                <w:szCs w:val="24"/>
+              </w:rPr>
+              <w:t>10k</w:t>
+            </w:r>
+          </w:p>
+        </w:tc>
+        <w:tc>
+          <w:tcPr>
+            <w:tcW w:w="2127" w:type="dxa"/>
+          </w:tcPr>
+          <w:p>
+            <w:pPr>
+              <w:pStyle w:val="ListParagraph"/>
+              <w:spacing w:line="360" w:lineRule="auto"/>
+              <w:ind w:left="0"/>
+              <w:rPr>
+                <w:sz w:val="24"/>
+                <w:szCs w:val="24"/>
+              </w:rPr>
+            </w:pPr>
+            <w:r>
+              <w:rPr>
+                <w:sz w:val="24"/>
+                <w:szCs w:val="24"/>
+              </w:rPr>
+              <w:t>1.00</w:t>
+            </w:r>
+          </w:p>
+        </w:tc>
+        <w:tc>
+          <w:tcPr>
+            <w:tcW w:w="1995" w:type="dxa"/>
+          </w:tcPr>
+          <w:p>
+            <w:pPr>
+              <w:pStyle w:val="ListParagraph"/>
+              <w:spacing w:line="360" w:lineRule="auto"/>
+              <w:ind w:left="0"/>
+              <w:rPr>
+                <w:sz w:val="24"/>
+                <w:szCs w:val="24"/>
+              </w:rPr>
+            </w:pPr>
+            <w:r>
+              <w:rPr>
+                <w:sz w:val="24"/>
+                <w:szCs w:val="24"/>
+              </w:rPr>
+              <w:t>0.83</w:t>
+            </w:r>
+          </w:p>
+        </w:tc>
+        <w:tc>
+          <w:tcPr>
+            <w:tcW w:w="1756" w:type="dxa"/>
+          </w:tcPr>
+          <w:p>
+            <w:pPr>
+              <w:pStyle w:val="ListParagraph"/>
+              <w:spacing w:line="360" w:lineRule="auto"/>
+              <w:ind w:left="0"/>
+              <w:rPr>
+                <w:sz w:val="24"/>
+                <w:szCs w:val="24"/>
+              </w:rPr>
+            </w:pPr>
+            <w:r>
+              <w:rPr>
+                <w:sz w:val="24"/>
+                <w:szCs w:val="24"/>
+              </w:rPr>
+              <w:t>0.91</w:t>
+            </w:r>
+          </w:p>
+        </w:tc>
+      </w:tr>
+      <w:tr>
+        <w:tc>
+          <w:tcPr>
+            <w:tcW w:w="2677" w:type="dxa"/>
+          </w:tcPr>
+          <w:p>
+            <w:pPr>
+              <w:pStyle w:val="ListParagraph"/>
+              <w:spacing w:line="360" w:lineRule="auto"/>
+              <w:ind w:left="0"/>
+              <w:rPr>
+                <w:sz w:val="24"/>
+                <w:szCs w:val="24"/>
+              </w:rPr>
+            </w:pPr>
+            <w:r>
+              <w:rPr>
+                <w:sz w:val="24"/>
+                <w:szCs w:val="24"/>
+              </w:rPr>
+              <w:t>5k</w:t>
+            </w:r>
+          </w:p>
+        </w:tc>
+        <w:tc>
+          <w:tcPr>
+            <w:tcW w:w="2127" w:type="dxa"/>
+          </w:tcPr>
+          <w:p>
+            <w:pPr>
+              <w:pStyle w:val="ListParagraph"/>
+              <w:spacing w:line="360" w:lineRule="auto"/>
+              <w:ind w:left="0"/>
+              <w:rPr>
+                <w:sz w:val="24"/>
+                <w:szCs w:val="24"/>
+              </w:rPr>
+            </w:pPr>
+            <w:r>
+              <w:rPr>
+                <w:sz w:val="24"/>
+                <w:szCs w:val="24"/>
+              </w:rPr>
+              <w:t>0.75</w:t>
+            </w:r>
+          </w:p>
+        </w:tc>
+        <w:tc>
+          <w:tcPr>
+            <w:tcW w:w="1995" w:type="dxa"/>
+          </w:tcPr>
+          <w:p>
+            <w:pPr>
+              <w:pStyle w:val="ListParagraph"/>
+              <w:spacing w:line="360" w:lineRule="auto"/>
+              <w:ind w:left="0"/>
+              <w:rPr>
+                <w:sz w:val="24"/>
+                <w:szCs w:val="24"/>
+              </w:rPr>
+            </w:pPr>
+            <w:r>
+              <w:rPr>
+                <w:sz w:val="24"/>
+                <w:szCs w:val="24"/>
+              </w:rPr>
+              <w:t>1.00</w:t>
+            </w:r>
+          </w:p>
+        </w:tc>
+        <w:tc>
+          <w:tcPr>
+            <w:tcW w:w="1756" w:type="dxa"/>
+          </w:tcPr>
+          <w:p>
+            <w:pPr>
+              <w:pStyle w:val="ListParagraph"/>
+              <w:spacing w:line="360" w:lineRule="auto"/>
+              <w:ind w:left="0"/>
+              <w:rPr>
+                <w:sz w:val="24"/>
+                <w:szCs w:val="24"/>
+              </w:rPr>
+            </w:pPr>
+            <w:r>
+              <w:rPr>
+                <w:sz w:val="24"/>
+                <w:szCs w:val="24"/>
+              </w:rPr>
+              <w:t>0.</w:t>
+            </w:r>
+            <w:r>
+              <w:rPr>
+                <w:sz w:val="24"/>
+                <w:szCs w:val="24"/>
+              </w:rPr>
+              <w:t>86</w:t>
+            </w:r>
+          </w:p>
+        </w:tc>
+      </w:tr>
+      <w:tr>
+        <w:tc>
+          <w:tcPr>
+            <w:tcW w:w="2677" w:type="dxa"/>
+          </w:tcPr>
+          <w:p>
+            <w:pPr>
+              <w:pStyle w:val="ListParagraph"/>
+              <w:spacing w:line="360" w:lineRule="auto"/>
+              <w:ind w:left="0"/>
+              <w:rPr>
+                <w:sz w:val="24"/>
+                <w:szCs w:val="24"/>
+              </w:rPr>
+            </w:pPr>
+            <w:r>
+              <w:rPr>
+                <w:sz w:val="24"/>
+                <w:szCs w:val="24"/>
+              </w:rPr>
+              <w:t>2k</w:t>
+            </w:r>
+          </w:p>
+        </w:tc>
+        <w:tc>
+          <w:tcPr>
+            <w:tcW w:w="2127" w:type="dxa"/>
+          </w:tcPr>
+          <w:p>
+            <w:pPr>
+              <w:pStyle w:val="ListParagraph"/>
+              <w:spacing w:line="360" w:lineRule="auto"/>
+              <w:ind w:left="0"/>
+              <w:rPr>
+                <w:sz w:val="24"/>
+                <w:szCs w:val="24"/>
+              </w:rPr>
+            </w:pPr>
+            <w:r>
+              <w:rPr>
+                <w:sz w:val="24"/>
+                <w:szCs w:val="24"/>
+              </w:rPr>
+              <w:t>1.00</w:t>
+            </w:r>
+          </w:p>
+        </w:tc>
+        <w:tc>
+          <w:tcPr>
+            <w:tcW w:w="1995" w:type="dxa"/>
+          </w:tcPr>
+          <w:p>
+            <w:pPr>
+              <w:pStyle w:val="ListParagraph"/>
+              <w:spacing w:line="360" w:lineRule="auto"/>
+              <w:ind w:left="0"/>
+              <w:rPr>
+                <w:sz w:val="24"/>
+                <w:szCs w:val="24"/>
+              </w:rPr>
+            </w:pPr>
+            <w:r>
+              <w:rPr>
+                <w:sz w:val="24"/>
+                <w:szCs w:val="24"/>
+              </w:rPr>
+              <w:t>0.86</w:t>
+            </w:r>
+          </w:p>
+        </w:tc>
+        <w:tc>
+          <w:tcPr>
+            <w:tcW w:w="1756" w:type="dxa"/>
+          </w:tcPr>
+          <w:p>
+            <w:pPr>
+              <w:pStyle w:val="ListParagraph"/>
+              <w:spacing w:line="360" w:lineRule="auto"/>
+              <w:ind w:left="0"/>
+              <w:rPr>
+                <w:sz w:val="24"/>
+                <w:szCs w:val="24"/>
+              </w:rPr>
+            </w:pPr>
+            <w:r>
+              <w:rPr>
+                <w:sz w:val="24"/>
+                <w:szCs w:val="24"/>
+              </w:rPr>
+              <w:t>0.92</w:t>
+            </w:r>
+          </w:p>
+        </w:tc>
+      </w:tr>
+      <w:tr>
+        <w:tc>
+          <w:tcPr>
+            <w:tcW w:w="2677" w:type="dxa"/>
+          </w:tcPr>
+          <w:p>
+            <w:pPr>
+              <w:pStyle w:val="ListParagraph"/>
+              <w:spacing w:line="360" w:lineRule="auto"/>
+              <w:ind w:left="0"/>
+              <w:rPr>
+                <w:b/>
+                <w:bCs/>
+                <w:sz w:val="24"/>
+                <w:szCs w:val="24"/>
+              </w:rPr>
+            </w:pPr>
+            <w:r>
+              <w:rPr>
+                <w:b/>
+                <w:bCs/>
+                <w:sz w:val="24"/>
+                <w:szCs w:val="24"/>
+              </w:rPr>
+              <w:t>Rata-rata (Average)</w:t>
+            </w:r>
+          </w:p>
+        </w:tc>
+        <w:tc>
+          <w:tcPr>
+            <w:tcW w:w="2127" w:type="dxa"/>
+          </w:tcPr>
+          <w:p>
+            <w:pPr>
+              <w:spacing w:line="360" w:lineRule="auto"/>
+              <w:rPr>
+                <w:sz w:val="24"/>
+                <w:szCs w:val="24"/>
+              </w:rPr>
+            </w:pPr>
+            <w:r>
+              <w:rPr>
+                <w:sz w:val="24"/>
+                <w:szCs w:val="24"/>
+              </w:rPr>
+              <w:t>0.95</w:t>
+            </w:r>
+          </w:p>
+        </w:tc>
+        <w:tc>
+          <w:tcPr>
+            <w:tcW w:w="1995" w:type="dxa"/>
+          </w:tcPr>
+          <w:p>
+            <w:pPr>
+              <w:pStyle w:val="ListParagraph"/>
+              <w:spacing w:line="360" w:lineRule="auto"/>
+              <w:ind w:left="0"/>
+              <w:rPr>
+                <w:sz w:val="24"/>
+                <w:szCs w:val="24"/>
+              </w:rPr>
+            </w:pPr>
+            <w:r>
+              <w:rPr>
+                <w:sz w:val="24"/>
+                <w:szCs w:val="24"/>
+              </w:rPr>
+              <w:t>0.95</w:t>
+            </w:r>
+          </w:p>
+        </w:tc>
+        <w:tc>
+          <w:tcPr>
+            <w:tcW w:w="1756" w:type="dxa"/>
+          </w:tcPr>
+          <w:p>
+            <w:pPr>
+              <w:pStyle w:val="ListParagraph"/>
+              <w:spacing w:line="360" w:lineRule="auto"/>
+              <w:ind w:left="0"/>
+              <w:rPr>
+                <w:sz w:val="24"/>
+                <w:szCs w:val="24"/>
+              </w:rPr>
+            </w:pPr>
+            <w:r>
+              <w:rPr>
+                <w:sz w:val="24"/>
+                <w:szCs w:val="24"/>
+              </w:rPr>
+              <w:t>0.</w:t>
+            </w:r>
+            <w:r>
+              <w:rPr>
+                <w:sz w:val="24"/>
+                <w:szCs w:val="24"/>
+              </w:rPr>
+              <w:t>95</w:t>
+            </w:r>
+          </w:p>
+        </w:tc>
+      </w:tr>
+    </w:tbl>
+    <w:p>
+      <w:pPr>
+        <w:pStyle w:val="ListParagraph"/>
+        <w:numPr>
+          <w:ilvl w:val="0"/>
+          <w:numId w:val="7"/>
+        </w:numPr>
+        <w:spacing w:line="360" w:lineRule="auto"/>
+        <w:ind w:left="426" w:hanging="425"/>
+        <w:rPr>
+          <w:sz w:val="24"/>
+          <w:szCs w:val="24"/>
+        </w:rPr>
+      </w:pPr>
+      <w:r>
+        <w:rPr>
+          <w:b/>
+          <w:bCs/>
+          <w:sz w:val="24"/>
+          <w:szCs w:val="24"/>
+        </w:rPr>
+        <w:t xml:space="preserve">Akurasi Keseluruhan (Overall Accuracy): </w:t>
+      </w:r>
+      <w:r>
+        <w:rPr>
+          <w:sz w:val="24"/>
+          <w:szCs w:val="24"/>
+        </w:rPr>
+        <w:t>0.95</w:t>
+      </w:r>
+    </w:p>
+    <w:p>
+      <w:pPr>
+        <w:pStyle w:val="ListParagraph"/>
+        <w:numPr>
+          <w:ilvl w:val="0"/>
+          <w:numId w:val="7"/>
+        </w:numPr>
+        <w:spacing w:line="360" w:lineRule="auto"/>
+        <w:ind w:left="426" w:hanging="425"/>
+        <w:rPr>
+          <w:sz w:val="24"/>
+          <w:szCs w:val="24"/>
+        </w:rPr>
+      </w:pPr>
+      <w:r>
+        <w:rPr>
+          <w:b/>
+          <w:bCs/>
+          <w:sz w:val="24"/>
+          <w:szCs w:val="24"/>
+        </w:rPr>
+        <w:t>Confussion Matrix:</w:t>
+      </w:r>
+    </w:p>
+    <w:p>
+      <w:pPr>
+        <w:pStyle w:val="ListParagraph"/>
+        <w:spacing w:line="360" w:lineRule="auto"/>
+        <w:ind w:left="426"/>
+        <w:rPr>
+          <w:sz w:val="24"/>
+          <w:szCs w:val="24"/>
+        </w:rPr>
+      </w:pPr>
+      <w:r>
+        <w:rPr>
+          <w:sz w:val="24"/>
+          <w:szCs w:val="24"/>
+        </w:rPr>
+        <w:drawing>
+          <wp:inline distT="0" distB="0" distL="0" distR="0" wp14:anchorId="301E7069" wp14:editId="4A8F083C">
+            <wp:extent cx="2720340" cy="2819986"/>
+            <wp:effectExtent l="0" t="0" r="3810" b="0"/>
+            <wp:docPr id="462224596" name="Picture 1"/>
+            <wp:cNvGraphicFramePr>
+              <a:graphicFrameLocks xmlns:a="http://schemas.openxmlformats.org/drawingml/2006/main" noChangeAspect="1"/>
+            </wp:cNvGraphicFramePr>
+            <a:graphic xmlns:a="http://schemas.openxmlformats.org/drawingml/2006/main">
+              <a:graphicData uri="http://schemas.openxmlformats.org/drawingml/2006/picture">
+                <pic:pic xmlns:pic="http://schemas.openxmlformats.org/drawingml/2006/picture">
+                  <pic:nvPicPr>
+                    <pic:cNvPr id="462224596" name=""/>
+                    <pic:cNvPicPr/>
+                  </pic:nvPicPr>
+                  <pic:blipFill>
+                    <a:blip r:embed="rId6"/>
+                    <a:stretch>
+                      <a:fillRect/>
+                    </a:stretch>
+                  </pic:blipFill>
+                  <pic:spPr>
+                    <a:xfrm>
+                      <a:off x="0" y="0"/>
+                      <a:ext cx="2735248" cy="2835440"/>
+                    </a:xfrm>
+                    <a:prstGeom prst="rect">
+                      <a:avLst/>
+                    </a:prstGeom>
+                  </pic:spPr>
+                </pic:pic>
+              </a:graphicData>
+            </a:graphic>
+          </wp:inline>
+        </w:drawing>
+      </w:r>
+    </w:p>
+    <w:p>
+      <w:pPr>
+        <w:pStyle w:val="ListParagraph"/>
+        <w:numPr>
+          <w:ilvl w:val="1"/>
+          <w:numId w:val="4"/>
+        </w:numPr>
+        <w:spacing w:line="360" w:lineRule="auto"/>
+        <w:ind w:left="426" w:hanging="426"/>
+        <w:rPr>
+          <w:sz w:val="24"/>
+          <w:szCs w:val="24"/>
+        </w:rPr>
+      </w:pPr>
+      <w:r>
+        <w:rPr>
+          <w:b/>
+          <w:bCs/>
+          <w:sz w:val="24"/>
+          <w:szCs w:val="24"/>
+        </w:rPr>
+        <w:t xml:space="preserve">Evaluasi Performa Model </w:t>
+      </w:r>
+      <w:r>
+        <w:rPr>
+          <w:b/>
+          <w:bCs/>
+          <w:sz w:val="24"/>
+          <w:szCs w:val="24"/>
+        </w:rPr>
+        <w:t xml:space="preserve">KNN </w:t>
+      </w:r>
+      <w:r>
+        <w:rPr>
+          <w:b/>
+          <w:bCs/>
+          <w:sz w:val="24"/>
+          <w:szCs w:val="24"/>
+        </w:rPr>
+        <w:t xml:space="preserve">dengan </w:t>
+      </w:r>
+      <w:r>
+        <w:rPr>
+          <w:b/>
+          <w:bCs/>
+          <w:sz w:val="24"/>
+          <w:szCs w:val="24"/>
+        </w:rPr>
+        <w:t>RGB</w:t>
+      </w:r>
+    </w:p>
+    <w:tbl>
+      <w:tblPr>
+        <w:tblStyle w:val="TableGrid"/>
+        <w:tblW w:w="0" w:type="auto"/>
+        <w:tblInd w:w="-5" w:type="dxa"/>
+        <w:tblLook w:val="04A0" w:firstRow="1" w:lastRow="0" w:firstColumn="1" w:lastColumn="0" w:noHBand="0" w:noVBand="1"/>
+      </w:tblPr>
+      <w:tblGrid>
+        <w:gridCol w:w="2677"/>
+        <w:gridCol w:w="2127"/>
+        <w:gridCol w:w="1995"/>
+        <w:gridCol w:w="1756"/>
+      </w:tblGrid>
+      <w:tr>
+        <w:tc>
+          <w:tcPr>
+            <w:tcW w:w="2677" w:type="dxa"/>
+          </w:tcPr>
+          <w:p>
+            <w:pPr>
+              <w:pStyle w:val="ListParagraph"/>
+              <w:spacing w:line="360" w:lineRule="auto"/>
+              <w:ind w:left="0"/>
+              <w:rPr>
+                <w:b/>
+                <w:bCs/>
+                <w:sz w:val="24"/>
+                <w:szCs w:val="24"/>
+              </w:rPr>
+            </w:pPr>
+            <w:r>
+              <w:rPr>
+                <w:b/>
+                <w:bCs/>
+                <w:sz w:val="24"/>
+                <w:szCs w:val="24"/>
+              </w:rPr>
+              <w:t>Kelas/Label</w:t>
+            </w:r>
+          </w:p>
+        </w:tc>
+        <w:tc>
+          <w:tcPr>
+            <w:tcW w:w="2127" w:type="dxa"/>
+          </w:tcPr>
+          <w:p>
+            <w:pPr>
+              <w:pStyle w:val="ListParagraph"/>
+              <w:spacing w:line="360" w:lineRule="auto"/>
+              <w:ind w:left="0"/>
+              <w:rPr>
+                <w:b/>
+                <w:bCs/>
+                <w:sz w:val="24"/>
+                <w:szCs w:val="24"/>
+              </w:rPr>
+            </w:pPr>
+            <w:r>
+              <w:rPr>
+                <w:b/>
+                <w:bCs/>
+                <w:sz w:val="24"/>
+                <w:szCs w:val="24"/>
+              </w:rPr>
+              <w:t>Precision</w:t>
+            </w:r>
+          </w:p>
+        </w:tc>
+        <w:tc>
+          <w:tcPr>
+            <w:tcW w:w="1995" w:type="dxa"/>
+          </w:tcPr>
+          <w:p>
+            <w:pPr>
+              <w:pStyle w:val="ListParagraph"/>
+              <w:spacing w:line="360" w:lineRule="auto"/>
+              <w:ind w:left="0"/>
+              <w:rPr>
+                <w:b/>
+                <w:bCs/>
+                <w:sz w:val="24"/>
+                <w:szCs w:val="24"/>
+              </w:rPr>
+            </w:pPr>
+            <w:r>
+              <w:rPr>
+                <w:b/>
+                <w:bCs/>
+                <w:sz w:val="24"/>
+                <w:szCs w:val="24"/>
+              </w:rPr>
+              <w:t>Recall</w:t>
+            </w:r>
+          </w:p>
+        </w:tc>
+        <w:tc>
+          <w:tcPr>
+            <w:tcW w:w="1756" w:type="dxa"/>
+          </w:tcPr>
+          <w:p>
+            <w:pPr>
+              <w:pStyle w:val="ListParagraph"/>
+              <w:spacing w:line="360" w:lineRule="auto"/>
+              <w:ind w:left="0"/>
+              <w:rPr>
+                <w:b/>
+                <w:bCs/>
+                <w:sz w:val="24"/>
+                <w:szCs w:val="24"/>
+              </w:rPr>
+            </w:pPr>
+            <w:r>
+              <w:rPr>
+                <w:b/>
+                <w:bCs/>
+                <w:sz w:val="24"/>
+                <w:szCs w:val="24"/>
+              </w:rPr>
+              <w:t>F1-Score</w:t>
+            </w:r>
+          </w:p>
+        </w:tc>
+      </w:tr>
+      <w:tr>
+        <w:tc>
+          <w:tcPr>
+            <w:tcW w:w="2677" w:type="dxa"/>
+          </w:tcPr>
+          <w:p>
+            <w:pPr>
+              <w:pStyle w:val="ListParagraph"/>
+              <w:spacing w:line="360" w:lineRule="auto"/>
+              <w:ind w:left="0"/>
+              <w:rPr>
+                <w:sz w:val="24"/>
+                <w:szCs w:val="24"/>
+              </w:rPr>
+            </w:pPr>
+            <w:r>
+              <w:rPr>
+                <w:sz w:val="24"/>
+                <w:szCs w:val="24"/>
+              </w:rPr>
+              <w:lastRenderedPageBreak/>
+              <w:t>100k</w:t>
+            </w:r>
+          </w:p>
+        </w:tc>
+        <w:tc>
+          <w:tcPr>
+            <w:tcW w:w="2127" w:type="dxa"/>
+          </w:tcPr>
+          <w:p>
+            <w:pPr>
+              <w:pStyle w:val="ListParagraph"/>
+              <w:spacing w:line="360" w:lineRule="auto"/>
+              <w:ind w:left="0"/>
+              <w:rPr>
+                <w:sz w:val="24"/>
+                <w:szCs w:val="24"/>
+              </w:rPr>
+            </w:pPr>
+            <w:r>
+              <w:rPr>
+                <w:sz w:val="24"/>
+                <w:szCs w:val="24"/>
+              </w:rPr>
+              <w:t>0.86</w:t>
+            </w:r>
+          </w:p>
+        </w:tc>
+        <w:tc>
+          <w:tcPr>
+            <w:tcW w:w="1995" w:type="dxa"/>
+          </w:tcPr>
+          <w:p>
+            <w:pPr>
+              <w:pStyle w:val="ListParagraph"/>
+              <w:spacing w:line="360" w:lineRule="auto"/>
+              <w:ind w:left="0"/>
+              <w:rPr>
+                <w:sz w:val="24"/>
+                <w:szCs w:val="24"/>
+              </w:rPr>
+            </w:pPr>
+            <w:r>
+              <w:rPr>
+                <w:sz w:val="24"/>
+                <w:szCs w:val="24"/>
+              </w:rPr>
+              <w:t>1.00</w:t>
+            </w:r>
+          </w:p>
+        </w:tc>
+        <w:tc>
+          <w:tcPr>
+            <w:tcW w:w="1756" w:type="dxa"/>
+          </w:tcPr>
+          <w:p>
+            <w:pPr>
+              <w:pStyle w:val="ListParagraph"/>
+              <w:spacing w:line="360" w:lineRule="auto"/>
+              <w:ind w:left="0"/>
+              <w:rPr>
+                <w:sz w:val="24"/>
+                <w:szCs w:val="24"/>
+              </w:rPr>
+            </w:pPr>
+            <w:r>
+              <w:rPr>
+                <w:sz w:val="24"/>
+                <w:szCs w:val="24"/>
+              </w:rPr>
+              <w:t>0.92</w:t>
+            </w:r>
+          </w:p>
+        </w:tc>
+      </w:tr>
+      <w:tr>
+        <w:tc>
+          <w:tcPr>
+            <w:tcW w:w="2677" w:type="dxa"/>
+          </w:tcPr>
+          <w:p>
+            <w:pPr>
+              <w:pStyle w:val="ListParagraph"/>
+              <w:spacing w:line="360" w:lineRule="auto"/>
+              <w:ind w:left="0"/>
+              <w:rPr>
+                <w:sz w:val="24"/>
+                <w:szCs w:val="24"/>
+              </w:rPr>
+            </w:pPr>
+            <w:r>
+              <w:rPr>
+                <w:sz w:val="24"/>
+                <w:szCs w:val="24"/>
+              </w:rPr>
+              <w:t>50k</w:t>
+            </w:r>
+          </w:p>
+        </w:tc>
+        <w:tc>
+          <w:tcPr>
+            <w:tcW w:w="2127" w:type="dxa"/>
+          </w:tcPr>
+          <w:p>
+            <w:pPr>
+              <w:pStyle w:val="ListParagraph"/>
+              <w:spacing w:line="360" w:lineRule="auto"/>
+              <w:ind w:left="0"/>
+              <w:rPr>
+                <w:sz w:val="24"/>
+                <w:szCs w:val="24"/>
+              </w:rPr>
+            </w:pPr>
+            <w:r>
+              <w:rPr>
+                <w:sz w:val="24"/>
+                <w:szCs w:val="24"/>
+              </w:rPr>
+              <w:t>1.00</w:t>
+            </w:r>
+          </w:p>
+        </w:tc>
+        <w:tc>
+          <w:tcPr>
+            <w:tcW w:w="1995" w:type="dxa"/>
+          </w:tcPr>
+          <w:p>
+            <w:pPr>
+              <w:pStyle w:val="ListParagraph"/>
+              <w:spacing w:line="360" w:lineRule="auto"/>
+              <w:ind w:left="0"/>
+              <w:rPr>
+                <w:sz w:val="24"/>
+                <w:szCs w:val="24"/>
+              </w:rPr>
+            </w:pPr>
+            <w:r>
+              <w:rPr>
+                <w:sz w:val="24"/>
+                <w:szCs w:val="24"/>
+              </w:rPr>
+              <w:t>1.00</w:t>
+            </w:r>
+          </w:p>
+        </w:tc>
+        <w:tc>
+          <w:tcPr>
+            <w:tcW w:w="1756" w:type="dxa"/>
+          </w:tcPr>
+          <w:p>
+            <w:pPr>
+              <w:pStyle w:val="ListParagraph"/>
+              <w:spacing w:line="360" w:lineRule="auto"/>
+              <w:ind w:left="0"/>
+              <w:rPr>
+                <w:sz w:val="24"/>
+                <w:szCs w:val="24"/>
+              </w:rPr>
+            </w:pPr>
+            <w:r>
+              <w:rPr>
+                <w:sz w:val="24"/>
+                <w:szCs w:val="24"/>
+              </w:rPr>
+              <w:t>1.00</w:t>
+            </w:r>
+          </w:p>
+        </w:tc>
+      </w:tr>
+      <w:tr>
+        <w:tc>
+          <w:tcPr>
+            <w:tcW w:w="2677" w:type="dxa"/>
+          </w:tcPr>
+          <w:p>
+            <w:pPr>
+              <w:pStyle w:val="ListParagraph"/>
+              <w:spacing w:line="360" w:lineRule="auto"/>
+              <w:ind w:left="0"/>
+              <w:rPr>
+                <w:sz w:val="24"/>
+                <w:szCs w:val="24"/>
+              </w:rPr>
+            </w:pPr>
+            <w:r>
+              <w:rPr>
+                <w:sz w:val="24"/>
+                <w:szCs w:val="24"/>
+              </w:rPr>
+              <w:t>20k</w:t>
+            </w:r>
+          </w:p>
+        </w:tc>
+        <w:tc>
+          <w:tcPr>
+            <w:tcW w:w="2127" w:type="dxa"/>
+          </w:tcPr>
+          <w:p>
+            <w:pPr>
+              <w:pStyle w:val="ListParagraph"/>
+              <w:spacing w:line="360" w:lineRule="auto"/>
+              <w:ind w:left="0"/>
+              <w:rPr>
+                <w:sz w:val="24"/>
+                <w:szCs w:val="24"/>
+              </w:rPr>
+            </w:pPr>
+            <w:r>
+              <w:rPr>
+                <w:sz w:val="24"/>
+                <w:szCs w:val="24"/>
+              </w:rPr>
+              <w:t>1.00</w:t>
+            </w:r>
+          </w:p>
+        </w:tc>
+        <w:tc>
+          <w:tcPr>
+            <w:tcW w:w="1995" w:type="dxa"/>
+          </w:tcPr>
+          <w:p>
+            <w:pPr>
+              <w:pStyle w:val="ListParagraph"/>
+              <w:spacing w:line="360" w:lineRule="auto"/>
+              <w:ind w:left="0"/>
+              <w:rPr>
+                <w:sz w:val="24"/>
+                <w:szCs w:val="24"/>
+              </w:rPr>
+            </w:pPr>
+            <w:r>
+              <w:rPr>
+                <w:sz w:val="24"/>
+                <w:szCs w:val="24"/>
+              </w:rPr>
+              <w:t>0.57</w:t>
+            </w:r>
+          </w:p>
+        </w:tc>
+        <w:tc>
+          <w:tcPr>
+            <w:tcW w:w="1756" w:type="dxa"/>
+          </w:tcPr>
+          <w:p>
+            <w:pPr>
+              <w:pStyle w:val="ListParagraph"/>
+              <w:spacing w:line="360" w:lineRule="auto"/>
+              <w:ind w:left="0"/>
+              <w:rPr>
+                <w:sz w:val="24"/>
+                <w:szCs w:val="24"/>
+              </w:rPr>
+            </w:pPr>
+            <w:r>
+              <w:rPr>
+                <w:sz w:val="24"/>
+                <w:szCs w:val="24"/>
+              </w:rPr>
+              <w:t>0.73</w:t>
+            </w:r>
+          </w:p>
+        </w:tc>
+      </w:tr>
+      <w:tr>
+        <w:tc>
+          <w:tcPr>
+            <w:tcW w:w="2677" w:type="dxa"/>
+          </w:tcPr>
+          <w:p>
+            <w:pPr>
+              <w:pStyle w:val="ListParagraph"/>
+              <w:spacing w:line="360" w:lineRule="auto"/>
+              <w:ind w:left="0"/>
+              <w:rPr>
+                <w:sz w:val="24"/>
+                <w:szCs w:val="24"/>
+              </w:rPr>
+            </w:pPr>
+            <w:r>
+              <w:rPr>
+                <w:sz w:val="24"/>
+                <w:szCs w:val="24"/>
+              </w:rPr>
+              <w:t>10k</w:t>
+            </w:r>
+          </w:p>
+        </w:tc>
+        <w:tc>
+          <w:tcPr>
+            <w:tcW w:w="2127" w:type="dxa"/>
+          </w:tcPr>
+          <w:p>
+            <w:pPr>
+              <w:pStyle w:val="ListParagraph"/>
+              <w:spacing w:line="360" w:lineRule="auto"/>
+              <w:ind w:left="0"/>
+              <w:rPr>
+                <w:sz w:val="24"/>
+                <w:szCs w:val="24"/>
+              </w:rPr>
+            </w:pPr>
+            <w:r>
+              <w:rPr>
+                <w:sz w:val="24"/>
+                <w:szCs w:val="24"/>
+              </w:rPr>
+              <w:t>0.36</w:t>
+            </w:r>
+          </w:p>
+        </w:tc>
+        <w:tc>
+          <w:tcPr>
+            <w:tcW w:w="1995" w:type="dxa"/>
+          </w:tcPr>
+          <w:p>
+            <w:pPr>
+              <w:pStyle w:val="ListParagraph"/>
+              <w:spacing w:line="360" w:lineRule="auto"/>
+              <w:ind w:left="0"/>
+              <w:rPr>
+                <w:sz w:val="24"/>
+                <w:szCs w:val="24"/>
+              </w:rPr>
+            </w:pPr>
+            <w:r>
+              <w:rPr>
+                <w:sz w:val="24"/>
+                <w:szCs w:val="24"/>
+              </w:rPr>
+              <w:t>0,83</w:t>
+            </w:r>
+          </w:p>
+        </w:tc>
+        <w:tc>
+          <w:tcPr>
+            <w:tcW w:w="1756" w:type="dxa"/>
+          </w:tcPr>
+          <w:p>
+            <w:pPr>
+              <w:pStyle w:val="ListParagraph"/>
+              <w:spacing w:line="360" w:lineRule="auto"/>
+              <w:ind w:left="0"/>
+              <w:rPr>
+                <w:sz w:val="24"/>
+                <w:szCs w:val="24"/>
+              </w:rPr>
+            </w:pPr>
+            <w:r>
+              <w:rPr>
+                <w:sz w:val="24"/>
+                <w:szCs w:val="24"/>
+              </w:rPr>
+              <w:t>0.50</w:t>
+            </w:r>
+          </w:p>
+        </w:tc>
+      </w:tr>
+      <w:tr>
+        <w:tc>
+          <w:tcPr>
+            <w:tcW w:w="2677" w:type="dxa"/>
+          </w:tcPr>
+          <w:p>
+            <w:pPr>
+              <w:pStyle w:val="ListParagraph"/>
+              <w:spacing w:line="360" w:lineRule="auto"/>
+              <w:ind w:left="0"/>
+              <w:rPr>
+                <w:sz w:val="24"/>
+                <w:szCs w:val="24"/>
+              </w:rPr>
+            </w:pPr>
+            <w:r>
+              <w:rPr>
+                <w:sz w:val="24"/>
+                <w:szCs w:val="24"/>
+              </w:rPr>
+              <w:t>5k</w:t>
+            </w:r>
+          </w:p>
+        </w:tc>
+        <w:tc>
+          <w:tcPr>
+            <w:tcW w:w="2127" w:type="dxa"/>
+          </w:tcPr>
+          <w:p>
+            <w:pPr>
+              <w:pStyle w:val="ListParagraph"/>
+              <w:spacing w:line="360" w:lineRule="auto"/>
+              <w:ind w:left="0"/>
+              <w:rPr>
+                <w:sz w:val="24"/>
+                <w:szCs w:val="24"/>
+              </w:rPr>
+            </w:pPr>
+            <w:r>
+              <w:rPr>
+                <w:sz w:val="24"/>
+                <w:szCs w:val="24"/>
+              </w:rPr>
+              <w:t>1.00</w:t>
+            </w:r>
+          </w:p>
+        </w:tc>
+        <w:tc>
+          <w:tcPr>
+            <w:tcW w:w="1995" w:type="dxa"/>
+          </w:tcPr>
+          <w:p>
+            <w:pPr>
+              <w:pStyle w:val="ListParagraph"/>
+              <w:spacing w:line="360" w:lineRule="auto"/>
+              <w:ind w:left="0"/>
+              <w:rPr>
+                <w:sz w:val="24"/>
+                <w:szCs w:val="24"/>
+              </w:rPr>
+            </w:pPr>
+            <w:r>
+              <w:rPr>
+                <w:sz w:val="24"/>
+                <w:szCs w:val="24"/>
+              </w:rPr>
+              <w:t>0.67</w:t>
+            </w:r>
+          </w:p>
+        </w:tc>
+        <w:tc>
+          <w:tcPr>
+            <w:tcW w:w="1756" w:type="dxa"/>
+          </w:tcPr>
+          <w:p>
+            <w:pPr>
+              <w:pStyle w:val="ListParagraph"/>
+              <w:spacing w:line="360" w:lineRule="auto"/>
+              <w:ind w:left="0"/>
+              <w:rPr>
+                <w:sz w:val="24"/>
+                <w:szCs w:val="24"/>
+              </w:rPr>
+            </w:pPr>
+            <w:r>
+              <w:rPr>
+                <w:sz w:val="24"/>
+                <w:szCs w:val="24"/>
+              </w:rPr>
+              <w:t>0.80</w:t>
+            </w:r>
+          </w:p>
+        </w:tc>
+      </w:tr>
+      <w:tr>
+        <w:tc>
+          <w:tcPr>
+            <w:tcW w:w="2677" w:type="dxa"/>
+          </w:tcPr>
+          <w:p>
+            <w:pPr>
+              <w:pStyle w:val="ListParagraph"/>
+              <w:spacing w:line="360" w:lineRule="auto"/>
+              <w:ind w:left="0"/>
+              <w:rPr>
+                <w:sz w:val="24"/>
+                <w:szCs w:val="24"/>
+              </w:rPr>
+            </w:pPr>
+            <w:r>
+              <w:rPr>
+                <w:sz w:val="24"/>
+                <w:szCs w:val="24"/>
+              </w:rPr>
+              <w:t>2k</w:t>
+            </w:r>
+          </w:p>
+        </w:tc>
+        <w:tc>
+          <w:tcPr>
+            <w:tcW w:w="2127" w:type="dxa"/>
+          </w:tcPr>
+          <w:p>
+            <w:pPr>
+              <w:pStyle w:val="ListParagraph"/>
+              <w:spacing w:line="360" w:lineRule="auto"/>
+              <w:ind w:left="0"/>
+              <w:rPr>
+                <w:sz w:val="24"/>
+                <w:szCs w:val="24"/>
+              </w:rPr>
+            </w:pPr>
+            <w:r>
+              <w:rPr>
+                <w:sz w:val="24"/>
+                <w:szCs w:val="24"/>
+              </w:rPr>
+              <w:t>0.67</w:t>
+            </w:r>
+          </w:p>
+        </w:tc>
+        <w:tc>
+          <w:tcPr>
+            <w:tcW w:w="1995" w:type="dxa"/>
+          </w:tcPr>
+          <w:p>
+            <w:pPr>
+              <w:pStyle w:val="ListParagraph"/>
+              <w:spacing w:line="360" w:lineRule="auto"/>
+              <w:ind w:left="0"/>
+              <w:rPr>
+                <w:sz w:val="24"/>
+                <w:szCs w:val="24"/>
+              </w:rPr>
+            </w:pPr>
+            <w:r>
+              <w:rPr>
+                <w:sz w:val="24"/>
+                <w:szCs w:val="24"/>
+              </w:rPr>
+              <w:t>0.29</w:t>
+            </w:r>
+          </w:p>
+        </w:tc>
+        <w:tc>
+          <w:tcPr>
+            <w:tcW w:w="1756" w:type="dxa"/>
+          </w:tcPr>
+          <w:p>
+            <w:pPr>
+              <w:pStyle w:val="ListParagraph"/>
+              <w:spacing w:line="360" w:lineRule="auto"/>
+              <w:ind w:left="0"/>
+              <w:rPr>
+                <w:sz w:val="24"/>
+                <w:szCs w:val="24"/>
+              </w:rPr>
+            </w:pPr>
+            <w:r>
+              <w:rPr>
+                <w:sz w:val="24"/>
+                <w:szCs w:val="24"/>
+              </w:rPr>
+              <w:t>0.40</w:t>
+            </w:r>
+          </w:p>
+        </w:tc>
+      </w:tr>
+      <w:tr>
+        <w:tc>
+          <w:tcPr>
+            <w:tcW w:w="2677" w:type="dxa"/>
+          </w:tcPr>
+          <w:p>
+            <w:pPr>
+              <w:pStyle w:val="ListParagraph"/>
+              <w:spacing w:line="360" w:lineRule="auto"/>
+              <w:ind w:left="0"/>
+              <w:rPr>
+                <w:b/>
+                <w:bCs/>
+                <w:sz w:val="24"/>
+                <w:szCs w:val="24"/>
+              </w:rPr>
+            </w:pPr>
+            <w:r>
+              <w:rPr>
+                <w:b/>
+                <w:bCs/>
+                <w:sz w:val="24"/>
+                <w:szCs w:val="24"/>
+              </w:rPr>
+              <w:t>Rata-rata (Average)</w:t>
+            </w:r>
+          </w:p>
+        </w:tc>
+        <w:tc>
+          <w:tcPr>
+            <w:tcW w:w="2127" w:type="dxa"/>
+          </w:tcPr>
+          <w:p>
+            <w:pPr>
+              <w:spacing w:line="360" w:lineRule="auto"/>
+              <w:rPr>
+                <w:sz w:val="24"/>
+                <w:szCs w:val="24"/>
+              </w:rPr>
+            </w:pPr>
+            <w:r>
+              <w:rPr>
+                <w:sz w:val="24"/>
+                <w:szCs w:val="24"/>
+              </w:rPr>
+              <w:t>0.81</w:t>
+            </w:r>
+          </w:p>
+        </w:tc>
+        <w:tc>
+          <w:tcPr>
+            <w:tcW w:w="1995" w:type="dxa"/>
+          </w:tcPr>
+          <w:p>
+            <w:pPr>
+              <w:pStyle w:val="ListParagraph"/>
+              <w:spacing w:line="360" w:lineRule="auto"/>
+              <w:ind w:left="0"/>
+              <w:rPr>
+                <w:sz w:val="24"/>
+                <w:szCs w:val="24"/>
+              </w:rPr>
+            </w:pPr>
+            <w:r>
+              <w:rPr>
+                <w:sz w:val="24"/>
+                <w:szCs w:val="24"/>
+              </w:rPr>
+              <w:t>0.73</w:t>
+            </w:r>
+          </w:p>
+        </w:tc>
+        <w:tc>
+          <w:tcPr>
+            <w:tcW w:w="1756" w:type="dxa"/>
+          </w:tcPr>
+          <w:p>
+            <w:pPr>
+              <w:pStyle w:val="ListParagraph"/>
+              <w:spacing w:line="360" w:lineRule="auto"/>
+              <w:ind w:left="0"/>
+              <w:rPr>
+                <w:sz w:val="24"/>
+                <w:szCs w:val="24"/>
+              </w:rPr>
+            </w:pPr>
+            <w:r>
+              <w:rPr>
+                <w:sz w:val="24"/>
+                <w:szCs w:val="24"/>
+              </w:rPr>
+              <w:t>0.73</w:t>
+            </w:r>
+          </w:p>
+        </w:tc>
+      </w:tr>
+    </w:tbl>
+    <w:p>
+      <w:pPr>
+        <w:pStyle w:val="ListParagraph"/>
+        <w:numPr>
+          <w:ilvl w:val="0"/>
+          <w:numId w:val="7"/>
+        </w:numPr>
+        <w:spacing w:line="360" w:lineRule="auto"/>
+        <w:ind w:left="426" w:hanging="425"/>
+        <w:rPr>
+          <w:sz w:val="24"/>
+          <w:szCs w:val="24"/>
+        </w:rPr>
+      </w:pPr>
+      <w:r>
+        <w:rPr>
+          <w:b/>
+          <w:bCs/>
+          <w:sz w:val="24"/>
+          <w:szCs w:val="24"/>
+        </w:rPr>
+        <w:t xml:space="preserve">Akurasi Keseluruhan (Overall Accuracy): </w:t>
+      </w:r>
+      <w:r>
+        <w:rPr>
+          <w:sz w:val="24"/>
+          <w:szCs w:val="24"/>
+        </w:rPr>
+        <w:t>0.</w:t>
+      </w:r>
+      <w:r>
+        <w:rPr>
+          <w:sz w:val="24"/>
+          <w:szCs w:val="24"/>
+        </w:rPr>
+        <w:t>72</w:t>
+      </w:r>
+    </w:p>
+    <w:p>
+      <w:pPr>
+        <w:pStyle w:val="ListParagraph"/>
+        <w:numPr>
+          <w:ilvl w:val="0"/>
+          <w:numId w:val="7"/>
+        </w:numPr>
+        <w:spacing w:line="360" w:lineRule="auto"/>
+        <w:ind w:left="426" w:hanging="425"/>
+        <w:rPr>
+          <w:sz w:val="24"/>
+          <w:szCs w:val="24"/>
+        </w:rPr>
+      </w:pPr>
+      <w:r>
+        <w:rPr>
+          <w:b/>
+          <w:bCs/>
+          <w:sz w:val="24"/>
+          <w:szCs w:val="24"/>
+        </w:rPr>
+        <w:t>Confussion Matrix:</w:t>
+      </w:r>
+    </w:p>
+    <w:p>
+      <w:pPr>
+        <w:pStyle w:val="ListParagraph"/>
+        <w:spacing w:line="360" w:lineRule="auto"/>
+        <w:ind w:left="426"/>
+        <w:rPr>
+          <w:sz w:val="24"/>
+          <w:szCs w:val="24"/>
+        </w:rPr>
+      </w:pPr>
+      <w:r>
+        <w:rPr>
+          <w:sz w:val="24"/>
+          <w:szCs w:val="24"/>
+        </w:rPr>
+        <w:drawing>
+          <wp:inline distT="0" distB="0" distL="0" distR="0" wp14:anchorId="5C65EDDE" wp14:editId="4D634E0A">
+            <wp:extent cx="5200650" cy="5391150"/>
+            <wp:effectExtent l="0" t="0" r="0" b="0"/>
+            <wp:docPr id="601526764" name="Picture 1"/>
+            <wp:cNvGraphicFramePr>
+              <a:graphicFrameLocks xmlns:a="http://schemas.openxmlformats.org/drawingml/2006/main" noChangeAspect="1"/>
+            </wp:cNvGraphicFramePr>
+            <a:graphic xmlns:a="http://schemas.openxmlformats.org/drawingml/2006/main">
+              <a:graphicData uri="http://schemas.openxmlformats.org/drawingml/2006/picture">
+                <pic:pic xmlns:pic="http://schemas.openxmlformats.org/drawingml/2006/picture">
+                  <pic:nvPicPr>
+                    <pic:cNvPr id="601526764" name=""/>
+                    <pic:cNvPicPr/>
+                  </pic:nvPicPr>
+                  <pic:blipFill>
+                    <a:blip r:embed="rId7"/>
+                    <a:stretch>
+                      <a:fillRect/>
+                    </a:stretch>
+                  </pic:blipFill>
+                  <pic:spPr>
+                    <a:xfrm>
+                      <a:off x="0" y="0"/>
+                      <a:ext cx="5200650" cy="5391150"/>
+                    </a:xfrm>
+                    <a:prstGeom prst="rect">
+                      <a:avLst/>
+                    </a:prstGeom>
+                  </pic:spPr>
+                </pic:pic>
+              </a:graphicData>
+            </a:graphic>
+          </wp:inline>
+        </w:drawing>
+      </w:r>
+    </w:p>
+    <w:p>
+      <w:pPr>
+        <w:spacing w:line="360" w:lineRule="auto"/>
+        <w:rPr>
+          <w:sz w:val="24"/>
+          <w:szCs w:val="24"/>
+        </w:rPr>
+      </w:pPr>
     </w:p>
     <w:p>
       <w:pPr>
@@ -3800,6 +6222,7 @@
   <w:style w:type="character" w:default="1" w:styleId="DefaultParagraphFont">
     <w:name w:val="Default Paragraph Font"/>
     <w:uiPriority w:val="1"/>
+    <w:semiHidden/>
     <w:unhideWhenUsed/>
   </w:style>
   <w:style w:type="table" w:default="1" w:styleId="TableNormal">

</xml_diff>